<commit_message>
Stop rendering internal data corrections as regulatory amendments
export_word.py now decides which provisions get the amended-by-government
highlight by reading provisions.latest_change_id, instead of just picking
the newest non-"New Provision" change_log row. That distinction matters:
our own one-time data corrections (CHG-0033..CHG-0039) deliberately do not
move latest_change_id, so they stay in the audit trail without being shown
to clients as if the government had changed the law.

docs/DPDP_Act_2023.docx is regenerated with this fix: 0 highlights, down
from the 7 sections it wrongly marked as amended.

Co-Authored-By: Claude Sonnet 5 <noreply@anthropic.com>
</commit_message>
<xml_diff>
--- a/docs/DPDP_Act_2023.docx
+++ b/docs/DPDP_Act_2023.docx
@@ -1452,7 +1452,6 @@
       <w:r>
         <w:rPr>
           <w:b/>
-          <w:highlight w:val="yellow"/>
         </w:rPr>
         <w:t>Section 7 — Certain legitimate uses</w:t>
       </w:r>
@@ -1462,9 +1461,6 @@
         <w:spacing w:after="160"/>
       </w:pPr>
       <w:r>
-        <w:rPr>
-          <w:highlight w:val="yellow"/>
-        </w:rPr>
         <w:t>A Data Fiduciary may process personal data of a Data Principal for any of the following legitimate uses, namely —</w:t>
       </w:r>
     </w:p>
@@ -1473,9 +1469,6 @@
         <w:spacing w:after="160"/>
       </w:pPr>
       <w:r>
-        <w:rPr>
-          <w:highlight w:val="yellow"/>
-        </w:rPr>
         <w:t>(a) for the specified purpose for which the Data Principal has voluntarily provided her personal data to the Data Fiduciary, and in respect of which she has not indicated to the Data Fiduciary that she does not consent to the use of her personal data;</w:t>
       </w:r>
     </w:p>
@@ -1484,36 +1477,24 @@
         <w:spacing w:after="160"/>
       </w:pPr>
       <w:r>
-        <w:rPr>
-          <w:highlight w:val="yellow"/>
-        </w:rPr>
         <w:t>(b) for the State and any of its instrumentalities to provide or issue to the Data Principal such subsidy, benefit, service, certificate, licence or permit as may be prescribed, where —</w:t>
       </w:r>
       <w:r>
         <w:br/>
       </w:r>
       <w:r>
-        <w:rPr>
-          <w:highlight w:val="yellow"/>
-        </w:rPr>
         <w:t>(i) she has previously consented to the processing of her personal data by the State or any of its instrumentalities for any subsidy, benefit, service, certificate, licence or permit; or</w:t>
       </w:r>
       <w:r>
         <w:br/>
       </w:r>
       <w:r>
-        <w:rPr>
-          <w:highlight w:val="yellow"/>
-        </w:rPr>
         <w:t>(ii) such personal data is available in digital form in, or in non-digital form and digitised subsequently from, any database, register, book or other document which is maintained by the State or any of its instrumentalities and is notified by the Central Government,</w:t>
       </w:r>
       <w:r>
         <w:br/>
       </w:r>
       <w:r>
-        <w:rPr>
-          <w:highlight w:val="yellow"/>
-        </w:rPr>
         <w:t>subject to standards followed for processing being in accordance with the policy issued by the Central Government or any law for the time being in force for governance of personal data;</w:t>
       </w:r>
     </w:p>
@@ -1522,9 +1503,6 @@
         <w:spacing w:after="160"/>
       </w:pPr>
       <w:r>
-        <w:rPr>
-          <w:highlight w:val="yellow"/>
-        </w:rPr>
         <w:t>(c) for the performance by the State or any of its instrumentalities of any function under any law for the time being in force in India, or in the interest of sovereignty and integrity of India or security of the State;</w:t>
       </w:r>
     </w:p>
@@ -1533,9 +1511,6 @@
         <w:spacing w:after="160"/>
       </w:pPr>
       <w:r>
-        <w:rPr>
-          <w:highlight w:val="yellow"/>
-        </w:rPr>
         <w:t>(d) for fulfilling any obligation under any law for the time being in force in India on any person to disclose any information to the State or any of its instrumentalities, subject to such processing being in accordance with the provisions regarding disclosure of such information in any other law for the time being in force;</w:t>
       </w:r>
     </w:p>
@@ -1544,9 +1519,6 @@
         <w:spacing w:after="160"/>
       </w:pPr>
       <w:r>
-        <w:rPr>
-          <w:highlight w:val="yellow"/>
-        </w:rPr>
         <w:t>(e) for compliance with any judgment or decree or order issued under any law for the time being in force in India, or any judgment or order relating to claims of a contractual or civil nature under any law in force outside India;</w:t>
       </w:r>
     </w:p>
@@ -1555,9 +1527,6 @@
         <w:spacing w:after="160"/>
       </w:pPr>
       <w:r>
-        <w:rPr>
-          <w:highlight w:val="yellow"/>
-        </w:rPr>
         <w:t>(f) for responding to a medical emergency involving a threat to the life or immediate threat to the health of the Data Principal or any other individual;</w:t>
       </w:r>
     </w:p>
@@ -1566,9 +1535,6 @@
         <w:spacing w:after="160"/>
       </w:pPr>
       <w:r>
-        <w:rPr>
-          <w:highlight w:val="yellow"/>
-        </w:rPr>
         <w:t>(g) for taking measures to provide medical treatment or health services to any individual during an epidemic, outbreak of disease, or any other threat to public health;</w:t>
       </w:r>
     </w:p>
@@ -1577,9 +1543,6 @@
         <w:spacing w:after="160"/>
       </w:pPr>
       <w:r>
-        <w:rPr>
-          <w:highlight w:val="yellow"/>
-        </w:rPr>
         <w:t>(h) for taking measures to ensure safety of, or provide assistance or services to, any individual during any disaster, or any breakdown of public order; or</w:t>
       </w:r>
     </w:p>
@@ -1588,173 +1551,7 @@
         <w:spacing w:after="160"/>
       </w:pPr>
       <w:r>
-        <w:rPr>
-          <w:highlight w:val="yellow"/>
-        </w:rPr>
         <w:t>(i) for the purposes of employment or those related to safeguarding the employer from loss or liability, such as prevention of corporate espionage, maintenance of confidentiality of trade secrets, intellectual property, classified information or provision of any service or benefit sought by a Data Principal who is an employee.</w:t>
-      </w:r>
-    </w:p>
-    <w:p>
-      <w:r>
-        <w:rPr>
-          <w:b/>
-          <w:color w:val="595959"/>
-          <w:sz w:val="18"/>
-        </w:rPr>
-        <w:t>Previous text (superseded):</w:t>
-      </w:r>
-    </w:p>
-    <w:p>
-      <w:pPr>
-        <w:spacing w:after="160"/>
-      </w:pPr>
-      <w:r>
-        <w:rPr>
-          <w:b/>
-          <w:strike/>
-          <w:color w:val="595959"/>
-        </w:rPr>
-        <w:t>Section 7 — Certain legitimate uses</w:t>
-      </w:r>
-    </w:p>
-    <w:p>
-      <w:pPr>
-        <w:spacing w:after="160"/>
-      </w:pPr>
-      <w:r>
-        <w:rPr>
-          <w:strike/>
-          <w:color w:val="595959"/>
-        </w:rPr>
-        <w:t>A Data Fiduciary may process personal data of a Data Principal for any of the following legitimate uses, namely —</w:t>
-      </w:r>
-    </w:p>
-    <w:p>
-      <w:pPr>
-        <w:spacing w:after="160"/>
-      </w:pPr>
-      <w:r>
-        <w:rPr>
-          <w:strike/>
-          <w:color w:val="595959"/>
-        </w:rPr>
-        <w:t>(a) for the specified purpose for which the Data Principal has voluntarily provided her personal data to the Data Fiduciary, and in respect of which she has not indicated to the Data Fiduciary that she does not consent to the use of her personal data;</w:t>
-      </w:r>
-    </w:p>
-    <w:p>
-      <w:pPr>
-        <w:spacing w:after="160"/>
-      </w:pPr>
-      <w:r>
-        <w:rPr>
-          <w:strike/>
-          <w:color w:val="595959"/>
-        </w:rPr>
-        <w:t>(b) for the State and any of its instrumentalities to provide or issue to the Data Principal such subsidy, benefit, service, certificate, licence or permit as may be prescribed, where —</w:t>
-      </w:r>
-      <w:r>
-        <w:br/>
-      </w:r>
-      <w:r>
-        <w:rPr>
-          <w:strike/>
-          <w:color w:val="595959"/>
-        </w:rPr>
-        <w:t>(i) she has previously consented to the processing of her personal data by the State or any of its instrumentalities for any subsidy, benefit, service, certificate, licence or permit; or</w:t>
-      </w:r>
-      <w:r>
-        <w:br/>
-      </w:r>
-      <w:r>
-        <w:rPr>
-          <w:strike/>
-          <w:color w:val="595959"/>
-        </w:rPr>
-        <w:t>(ii) such processing is in accordance with any policy formulated in accordance with any law for the time being in force, or any standards prescribed for that purpose;</w:t>
-      </w:r>
-    </w:p>
-    <w:p>
-      <w:pPr>
-        <w:spacing w:after="160"/>
-      </w:pPr>
-      <w:r>
-        <w:rPr>
-          <w:strike/>
-          <w:color w:val="595959"/>
-        </w:rPr>
-        <w:t>(c) for the performance by the State or any of its instrumentalities of any function under any law for the time being in force in India, or in the interest of sovereignty and integrity of India or security of the State, for that purpose;</w:t>
-      </w:r>
-    </w:p>
-    <w:p>
-      <w:pPr>
-        <w:spacing w:after="160"/>
-      </w:pPr>
-      <w:r>
-        <w:rPr>
-          <w:strike/>
-          <w:color w:val="595959"/>
-        </w:rPr>
-        <w:t>(d) for fulfilling any obligation under any law for the time being in force in India on any person to disclose any information to the State or any of its instrumentalities, subject to such processing being in accordance with the provisions regarding disclosure of such information in any other law for the time being in force;</w:t>
-      </w:r>
-    </w:p>
-    <w:p>
-      <w:pPr>
-        <w:spacing w:after="160"/>
-      </w:pPr>
-      <w:r>
-        <w:rPr>
-          <w:strike/>
-          <w:color w:val="595959"/>
-        </w:rPr>
-        <w:t>(e) for compliance with any judgment or decree or order issued under any law for the time being in force in India, or any judgment or order relating to claims of a contractual or civil nature under any law in force outside India;</w:t>
-      </w:r>
-    </w:p>
-    <w:p>
-      <w:pPr>
-        <w:spacing w:after="160"/>
-      </w:pPr>
-      <w:r>
-        <w:rPr>
-          <w:strike/>
-          <w:color w:val="595959"/>
-        </w:rPr>
-        <w:t>(f) for responding to a medical emergency involving a threat to the life or immediate threat to the health of the Data Principal or any other individual;</w:t>
-      </w:r>
-    </w:p>
-    <w:p>
-      <w:pPr>
-        <w:spacing w:after="160"/>
-      </w:pPr>
-      <w:r>
-        <w:rPr>
-          <w:strike/>
-          <w:color w:val="595959"/>
-        </w:rPr>
-        <w:t>(g) for taking measures to provide medical treatment or health services to any individual during an epidemic, outbreak of disease, or any other threat to public health;</w:t>
-      </w:r>
-    </w:p>
-    <w:p>
-      <w:pPr>
-        <w:spacing w:after="160"/>
-      </w:pPr>
-      <w:r>
-        <w:rPr>
-          <w:strike/>
-          <w:color w:val="595959"/>
-        </w:rPr>
-        <w:t>(h) for taking measures to ensure safety of, or provide assistance or services to, any individual during any disaster, or any breakdown of public order; or</w:t>
-      </w:r>
-    </w:p>
-    <w:p>
-      <w:pPr>
-        <w:spacing w:after="160"/>
-      </w:pPr>
-      <w:r>
-        <w:rPr>
-          <w:strike/>
-          <w:color w:val="595959"/>
-        </w:rPr>
-        <w:t>(i) for the purposes of employment or those related to safeguarding the employer from loss or liability, such as prevention of corporate espionage, maintenance of confidentiality of trade secrets, intellectual property, classified information or provision of any service to, or benefit sought by, Data Principal who is an employee.</w:t>
       </w:r>
     </w:p>
     <w:p>
@@ -1764,7 +1561,7 @@
           <w:color w:val="595959"/>
           <w:sz w:val="17"/>
         </w:rPr>
-        <w:t>Note: In force eighteen months after notification (G.S.R. 843(E), group (c)) — not yet operative. Text corrected 2026-09-23 against the official Act PDF (SHA-256 4deb2398...7d15), independently verified twice (two PDF extraction methods, two review passes) — see docs/act_table_audit_2026-09-23.md.</w:t>
+        <w:t>Note: In force eighteen months after notification (G.S.R. 843(E), group (c)) — not yet operative. Text corrected 2026-09-23 against the official Act PDF (SHA-256 4deb2398...7d15), re-verified against a hash-confirmed copy of the source PDF (second extraction pass; Sonnet+Opus review) — see docs/act_table_audit_2026-09-23.md.</w:t>
       </w:r>
     </w:p>
     <w:p/>
@@ -2571,7 +2368,6 @@
       <w:r>
         <w:rPr>
           <w:b/>
-          <w:highlight w:val="yellow"/>
         </w:rPr>
         <w:t>Section 17 — Exemptions</w:t>
       </w:r>
@@ -2581,9 +2377,6 @@
         <w:spacing w:after="160"/>
       </w:pPr>
       <w:r>
-        <w:rPr>
-          <w:highlight w:val="yellow"/>
-        </w:rPr>
         <w:t>(1) The provisions of Chapter II, except sub-sections (1) and (5) of section 8, and those of Chapter III and section 16 shall not apply where — (a) the processing of personal data is necessary for enforcing any legal right or claim; (b) the processing of personal data by any court or tribunal or any other body in India which is entrusted by law with the performance of any judicial or quasi-judicial or regulatory or supervisory function, where such processing is necessary for the performance of such function; (c) personal data is processed in the interest of prevention, detection, investigation or prosecution of any offence or contravention of any law for the time being in force in India; (d) personal data of Data Principals not within the territory of India is processed pursuant to any contract entered into with any person outside the territory of India by any person based in India; (e) the processing is necessary for a scheme of compromise or arrangement or merger or amalgamation of two or more companies or a reconstruction by way of demerger or otherwise of a company, or transfer of undertaking of one or more company to another company, or involving division of one or more companies, approved by a court or tribunal or other authority competent to do so by any law for the time being in force; and (f) the processing is for the purpose of ascertaining the financial information and assets and liabilities of any person who has defaulted in payment due on account of a loan or advance taken from a financial institution, subject to such processing being in accordance with the provisions regarding disclosure of information or data in any other law for the time being in force.</w:t>
       </w:r>
     </w:p>
@@ -2592,9 +2385,6 @@
         <w:spacing w:after="160"/>
       </w:pPr>
       <w:r>
-        <w:rPr>
-          <w:highlight w:val="yellow"/>
-        </w:rPr>
         <w:t>Explanation.— "default" and "financial institution" have the meanings assigned to them in sub-sections (12) and (14) of section 3 of the Insolvency and Bankruptcy Code, 2016.</w:t>
       </w:r>
     </w:p>
@@ -2603,9 +2393,6 @@
         <w:spacing w:after="160"/>
       </w:pPr>
       <w:r>
-        <w:rPr>
-          <w:highlight w:val="yellow"/>
-        </w:rPr>
         <w:t>(2) The provisions of this Act shall not apply in respect of the processing of personal data — (a) by such instrumentality of the State as the Central Government may notify, in the interests of sovereignty and integrity of India, security of the State, friendly relations with foreign States, maintenance of public order or preventing incitement to any cognizable offence relating to any of these, and the processing by the Central Government of any personal data that such instrumentality may furnish to it; and (b) necessary for research, archiving or statistical purposes if the personal data is not to be used to take any decision specific to a Data Principal and such processing is carried on in accordance with such standards as may be prescribed.</w:t>
       </w:r>
     </w:p>
@@ -2614,9 +2401,6 @@
         <w:spacing w:after="160"/>
       </w:pPr>
       <w:r>
-        <w:rPr>
-          <w:highlight w:val="yellow"/>
-        </w:rPr>
         <w:t>(3) The Central Government may, having regard to the volume and nature of personal data processed, notify certain Data Fiduciaries or class of Data Fiduciaries, including startups, as Data Fiduciaries to whom the provisions of section 5, sub-sections (3) and (7) of section 8 and sections 10 and 11 shall not apply.</w:t>
       </w:r>
     </w:p>
@@ -2625,9 +2409,6 @@
         <w:spacing w:after="160"/>
       </w:pPr>
       <w:r>
-        <w:rPr>
-          <w:highlight w:val="yellow"/>
-        </w:rPr>
         <w:t>Explanation.— "startup" means a private limited company, partnership firm or limited liability partnership incorporated in India that is eligible to be, and is recognised as, a startup under the criteria and process notified by the department responsible for startups in the Central Government.</w:t>
       </w:r>
     </w:p>
@@ -2636,9 +2417,6 @@
         <w:spacing w:after="160"/>
       </w:pPr>
       <w:r>
-        <w:rPr>
-          <w:highlight w:val="yellow"/>
-        </w:rPr>
         <w:t>(4) In respect of processing by the State or any instrumentality of the State, the provisions of sub-section (7) of section 8 and sub-section (3) of section 12 and, where such processing is for a purpose that does not include making of a decision that affects the Data Principal, sub-section (2) of section 12 shall not apply.</w:t>
       </w:r>
     </w:p>
@@ -2647,93 +2425,7 @@
         <w:spacing w:after="160"/>
       </w:pPr>
       <w:r>
-        <w:rPr>
-          <w:highlight w:val="yellow"/>
-        </w:rPr>
         <w:t>(5) The Central Government may, before expiry of five years from the date of commencement of this Act, by notification, declare that any provision of this Act shall not apply to such Data Fiduciary or classes of Data Fiduciaries for such period as may be specified in the notification.</w:t>
-      </w:r>
-    </w:p>
-    <w:p>
-      <w:r>
-        <w:rPr>
-          <w:b/>
-          <w:color w:val="595959"/>
-          <w:sz w:val="18"/>
-        </w:rPr>
-        <w:t>Previous text (superseded):</w:t>
-      </w:r>
-    </w:p>
-    <w:p>
-      <w:pPr>
-        <w:spacing w:after="160"/>
-      </w:pPr>
-      <w:r>
-        <w:rPr>
-          <w:b/>
-          <w:strike/>
-          <w:color w:val="595959"/>
-        </w:rPr>
-        <w:t>Section 17 — Exemptions</w:t>
-      </w:r>
-    </w:p>
-    <w:p>
-      <w:pPr>
-        <w:spacing w:after="160"/>
-      </w:pPr>
-      <w:r>
-        <w:rPr>
-          <w:strike/>
-          <w:color w:val="595959"/>
-        </w:rPr>
-        <w:t>(1) The provisions of Chapter II, except sub-sections (1) and (5) of section 8, and Chapter III shall not apply where — (a) processing of personal data is necessary for enforcing any legal right or claim; (b) processing of personal data by any court or tribunal or any other body in India which is entrusted by law with the performance of any judicial or quasi-judicial or regulatory or supervisory function, where such processing is necessary for the performance of such function; (c) processing of personal data is necessary for the purpose of prevention, detection, investigation or prosecution of any offence or contravention of any law for the time being in force in India; (d) processing of personal data of Data Principals not within the territory of India pursuant to any contract entered into with any person outside the territory of India, including any body corporate incorporated outside the territory of India, by any person based in India; (e) processing is necessary for a scheme of compromise or arrangement or merger or amalgamation of two or more companies or a reconstruction by way of demerger or otherwise of a company, or transfer of undertaking of one or more company to another company, or involving division of one or more companies, approved by a court, tribunal or other authority competent to do so by law; or (f) processing is for ascertaining the financial information and assets and liabilities of any person who has defaulted in payment due on account of a loan or advance taken from a financial institution, subject to such processing being in accordance with the provisions regarding disclosure of such information in any other law for the time being in force.</w:t>
-      </w:r>
-    </w:p>
-    <w:p>
-      <w:pPr>
-        <w:spacing w:after="160"/>
-      </w:pPr>
-      <w:r>
-        <w:rPr>
-          <w:strike/>
-          <w:color w:val="595959"/>
-        </w:rPr>
-        <w:t>(2) The provisions of this Act shall not apply in respect of the processing of personal data — (a) by such instrumentality of the State as the Central Government may notify, in the interest of sovereignty and integrity of India, security of the State, friendly relations with foreign States, maintenance of public order or preventing incitement to any cognizable offence relating to any of these, subject to such procedural safeguards as may be prescribed; and (b) necessary for research, archiving or statistical purposes if the personal data is not to be used to take any decision specific to a Data Principal and such processing is carried on in accordance with such standards as may be prescribed.</w:t>
-      </w:r>
-    </w:p>
-    <w:p>
-      <w:pPr>
-        <w:spacing w:after="160"/>
-      </w:pPr>
-      <w:r>
-        <w:rPr>
-          <w:strike/>
-          <w:color w:val="595959"/>
-        </w:rPr>
-        <w:t>(3) The Central Government may, before expiry of five years from the date of commencement of this Act, notify that any provision of this Act shall not apply to such class of Data Fiduciaries, including start-ups, for such period as may be specified in the notification, having regard to the volume and nature of personal data processed.</w:t>
-      </w:r>
-    </w:p>
-    <w:p>
-      <w:pPr>
-        <w:spacing w:after="160"/>
-      </w:pPr>
-      <w:r>
-        <w:rPr>
-          <w:strike/>
-          <w:color w:val="595959"/>
-        </w:rPr>
-        <w:t>(4) The provisions of sub-section (7) of section 8 and sub-section (3) of section 12, other than for the purposes referred to in clause (b) of sub-section (1) of this section, shall not apply in respect of processing by the State or any instrumentality of the State.</w:t>
-      </w:r>
-    </w:p>
-    <w:p>
-      <w:pPr>
-        <w:spacing w:after="160"/>
-      </w:pPr>
-      <w:r>
-        <w:rPr>
-          <w:strike/>
-          <w:color w:val="595959"/>
-        </w:rPr>
-        <w:t>(5) The Central Government may, by notification, exempt, from the application of provisions of this Act, the processing of personal data — (a) of Data Principals not within the territory of India; and (b) necessary for the purpose of research, archiving or statistical purposes, subject to such standards as may be prescribed.</w:t>
       </w:r>
     </w:p>
     <w:p>
@@ -2743,7 +2435,7 @@
           <w:color w:val="595959"/>
           <w:sz w:val="17"/>
         </w:rPr>
-        <w:t>Note: In force eighteen months after notification (G.S.R. 843(E), group (c)) — not yet operative. Text corrected 2026-09-23 against the official Act PDF (SHA-256 4deb2398...7d15), independently verified twice (two PDF extraction methods, two review passes) — see docs/act_table_audit_2026-09-23.md.</w:t>
+        <w:t>Note: In force eighteen months after notification (G.S.R. 843(E), group (c)) — not yet operative. Text corrected 2026-09-23 against the official Act PDF (SHA-256 4deb2398...7d15), re-verified against a hash-confirmed copy of the source PDF (second extraction pass; Sonnet+Opus review) — see docs/act_table_audit_2026-09-23.md.</w:t>
       </w:r>
     </w:p>
     <w:p/>
@@ -3308,7 +3000,6 @@
       <w:r>
         <w:rPr>
           <w:b/>
-          <w:highlight w:val="yellow"/>
         </w:rPr>
         <w:t>Section 26 — Powers of Chairperson</w:t>
       </w:r>
@@ -3318,9 +3009,6 @@
         <w:spacing w:after="160"/>
       </w:pPr>
       <w:r>
-        <w:rPr>
-          <w:highlight w:val="yellow"/>
-        </w:rPr>
         <w:t>The Chairperson shall exercise the following powers, namely —</w:t>
       </w:r>
     </w:p>
@@ -3329,9 +3017,6 @@
         <w:spacing w:after="160"/>
       </w:pPr>
       <w:r>
-        <w:rPr>
-          <w:highlight w:val="yellow"/>
-        </w:rPr>
         <w:t>(a) general superintendence and giving direction in respect of all administrative matters of the Board;</w:t>
       </w:r>
     </w:p>
@@ -3340,9 +3025,6 @@
         <w:spacing w:after="160"/>
       </w:pPr>
       <w:r>
-        <w:rPr>
-          <w:highlight w:val="yellow"/>
-        </w:rPr>
         <w:t>(b) authorise any officer of the Board to scrutinise any intimation, complaint, reference or correspondence addressed to the Board; and</w:t>
       </w:r>
     </w:p>
@@ -3351,69 +3033,7 @@
         <w:spacing w:after="160"/>
       </w:pPr>
       <w:r>
-        <w:rPr>
-          <w:highlight w:val="yellow"/>
-        </w:rPr>
         <w:t>(c) authorise performance of any of the functions of the Board and conduct any of its proceedings, by an individual Member or groups of Members and to allocate proceedings among them.</w:t>
-      </w:r>
-    </w:p>
-    <w:p>
-      <w:r>
-        <w:rPr>
-          <w:b/>
-          <w:color w:val="595959"/>
-          <w:sz w:val="18"/>
-        </w:rPr>
-        <w:t>Previous text (superseded):</w:t>
-      </w:r>
-    </w:p>
-    <w:p>
-      <w:pPr>
-        <w:spacing w:after="160"/>
-      </w:pPr>
-      <w:r>
-        <w:rPr>
-          <w:b/>
-          <w:strike/>
-          <w:color w:val="595959"/>
-        </w:rPr>
-        <w:t>Section 26 — Powers of Chairperson</w:t>
-      </w:r>
-    </w:p>
-    <w:p>
-      <w:pPr>
-        <w:spacing w:after="160"/>
-      </w:pPr>
-      <w:r>
-        <w:rPr>
-          <w:strike/>
-          <w:color w:val="595959"/>
-        </w:rPr>
-        <w:t>(1) The Chairperson shall exercise such powers, as may be prescribed, of general superintendence and direction in respect of all administrative matters of the Board: Provided that the Chairperson may authorise any Member or officer of the Board to scrutinise any intimation, complaint, reference or direction received by the Board, in accordance with the provisions of this Act.</w:t>
-      </w:r>
-    </w:p>
-    <w:p>
-      <w:pPr>
-        <w:spacing w:after="160"/>
-      </w:pPr>
-      <w:r>
-        <w:rPr>
-          <w:strike/>
-          <w:color w:val="595959"/>
-        </w:rPr>
-        <w:t>(2) The Chairperson may authorise any Member or a group of Members to exercise such powers and perform such functions as may be prescribed and such Member or group of Members may exercise such powers and perform such functions, including conducting proceedings of the Board under this Act, subject to such conditions as may be specified in such authorisation.</w:t>
-      </w:r>
-    </w:p>
-    <w:p>
-      <w:pPr>
-        <w:spacing w:after="160"/>
-      </w:pPr>
-      <w:r>
-        <w:rPr>
-          <w:strike/>
-          <w:color w:val="595959"/>
-        </w:rPr>
-        <w:t>(3) The Chairperson may constitute Benches, as may be necessary, comprising one or more Members for exercise of the powers and performance of the functions of the Board and allocate the requisite items of work amongst such Benches.</w:t>
       </w:r>
     </w:p>
     <w:p>
@@ -3423,7 +3043,7 @@
           <w:color w:val="595959"/>
           <w:sz w:val="17"/>
         </w:rPr>
-        <w:t>Note: Currently in force. Text corrected 2026-09-23 against the official Act PDF (SHA-256 4deb2398...7d15), independently verified twice (two PDF extraction methods, two review passes) — see docs/act_table_audit_2026-09-23.md.</w:t>
+        <w:t>Note: Currently in force. Text corrected 2026-09-23 against the official Act PDF (SHA-256 4deb2398...7d15), re-verified against a hash-confirmed copy of the source PDF (second extraction pass; Sonnet+Opus review) — see docs/act_table_audit_2026-09-23.md.</w:t>
       </w:r>
     </w:p>
     <w:p/>
@@ -3588,7 +3208,6 @@
       <w:r>
         <w:rPr>
           <w:b/>
-          <w:highlight w:val="yellow"/>
         </w:rPr>
         <w:t>Section 28 — Procedure to be followed by Board</w:t>
       </w:r>
@@ -3598,9 +3217,6 @@
         <w:spacing w:after="160"/>
       </w:pPr>
       <w:r>
-        <w:rPr>
-          <w:highlight w:val="yellow"/>
-        </w:rPr>
         <w:t>(1) The Board shall function as an independent body and shall, as far as practicable, function as a digital office, with the receipt of complaints and the allocation, hearing and pronouncement of decisions in respect of the same being digital by design, and adopt such techno-legal measures as may be prescribed.</w:t>
       </w:r>
     </w:p>
@@ -3609,9 +3225,6 @@
         <w:spacing w:after="160"/>
       </w:pPr>
       <w:r>
-        <w:rPr>
-          <w:highlight w:val="yellow"/>
-        </w:rPr>
         <w:t>(2) The Board may, on receipt of an intimation or complaint or reference or directions as referred to in sub-section (1) of section 27, take action in accordance with the provisions of this Act and the rules made thereunder.</w:t>
       </w:r>
     </w:p>
@@ -3620,9 +3233,6 @@
         <w:spacing w:after="160"/>
       </w:pPr>
       <w:r>
-        <w:rPr>
-          <w:highlight w:val="yellow"/>
-        </w:rPr>
         <w:t>(3) The Board shall determine whether there are sufficient grounds to proceed with an inquiry.</w:t>
       </w:r>
     </w:p>
@@ -3631,9 +3241,6 @@
         <w:spacing w:after="160"/>
       </w:pPr>
       <w:r>
-        <w:rPr>
-          <w:highlight w:val="yellow"/>
-        </w:rPr>
         <w:t>(4) In case the Board determines that there are insufficient grounds, it may, for reasons to be recorded in writing, close the proceedings.</w:t>
       </w:r>
     </w:p>
@@ -3642,9 +3249,6 @@
         <w:spacing w:after="160"/>
       </w:pPr>
       <w:r>
-        <w:rPr>
-          <w:highlight w:val="yellow"/>
-        </w:rPr>
         <w:t>(5) In case the Board determines that there are sufficient grounds to proceed with inquiry, it may, for reasons to be recorded in writing, inquire into the affairs of any person for ascertaining whether such person is complying with or has complied with the provisions of this Act.</w:t>
       </w:r>
     </w:p>
@@ -3653,9 +3257,6 @@
         <w:spacing w:after="160"/>
       </w:pPr>
       <w:r>
-        <w:rPr>
-          <w:highlight w:val="yellow"/>
-        </w:rPr>
         <w:t>(6) The Board shall conduct such inquiry following the principles of natural justice and shall record reasons for its actions during the course of such inquiry.</w:t>
       </w:r>
     </w:p>
@@ -3664,9 +3265,6 @@
         <w:spacing w:after="160"/>
       </w:pPr>
       <w:r>
-        <w:rPr>
-          <w:highlight w:val="yellow"/>
-        </w:rPr>
         <w:t>(7) For the purposes of discharging its functions under this Act, the Board shall have the same powers as are vested in a civil court under the Code of Civil Procedure, 1908, in respect of matters relating to — (a) summoning and enforcing the attendance of any person and examining her on oath; (b) receiving evidence of affidavit requiring the discovery and production of documents; (c) inspecting any data, book, document, register, books of account or any other document; and (d) such other matters as may be prescribed.</w:t>
       </w:r>
     </w:p>
@@ -3675,9 +3273,6 @@
         <w:spacing w:after="160"/>
       </w:pPr>
       <w:r>
-        <w:rPr>
-          <w:highlight w:val="yellow"/>
-        </w:rPr>
         <w:t>(8) The Board or its officers shall not prevent access to any premises or take into custody any equipment or any item that may adversely affect the day-to-day functioning of a person.</w:t>
       </w:r>
     </w:p>
@@ -3686,9 +3281,6 @@
         <w:spacing w:after="160"/>
       </w:pPr>
       <w:r>
-        <w:rPr>
-          <w:highlight w:val="yellow"/>
-        </w:rPr>
         <w:t>(9) The Board may require the services of any police officer or any officer of the Central Government or a State Government to assist it for the purposes of this section and it shall be the duty of every such officer to comply with such requisition.</w:t>
       </w:r>
     </w:p>
@@ -3697,9 +3289,6 @@
         <w:spacing w:after="160"/>
       </w:pPr>
       <w:r>
-        <w:rPr>
-          <w:highlight w:val="yellow"/>
-        </w:rPr>
         <w:t>(10) During the course of the inquiry, if the Board considers it necessary, it may for reasons to be recorded in writing, issue interim orders after giving the person concerned an opportunity of being heard.</w:t>
       </w:r>
     </w:p>
@@ -3708,9 +3297,6 @@
         <w:spacing w:after="160"/>
       </w:pPr>
       <w:r>
-        <w:rPr>
-          <w:highlight w:val="yellow"/>
-        </w:rPr>
         <w:t>(11) On completion of the inquiry and after giving the person concerned an opportunity of being heard, the Board may for reasons to be recorded in writing, either close the proceedings or proceed in accordance with section 33.</w:t>
       </w:r>
     </w:p>
@@ -3719,177 +3305,7 @@
         <w:spacing w:after="160"/>
       </w:pPr>
       <w:r>
-        <w:rPr>
-          <w:highlight w:val="yellow"/>
-        </w:rPr>
         <w:t>(12) At any stage after receipt of a complaint, if the Board is of the opinion that the complaint is false or frivolous, it may issue a warning or impose costs on the complainant.</w:t>
-      </w:r>
-    </w:p>
-    <w:p>
-      <w:r>
-        <w:rPr>
-          <w:b/>
-          <w:color w:val="595959"/>
-          <w:sz w:val="18"/>
-        </w:rPr>
-        <w:t>Previous text (superseded):</w:t>
-      </w:r>
-    </w:p>
-    <w:p>
-      <w:pPr>
-        <w:spacing w:after="160"/>
-      </w:pPr>
-      <w:r>
-        <w:rPr>
-          <w:b/>
-          <w:strike/>
-          <w:color w:val="595959"/>
-        </w:rPr>
-        <w:t>Section 28 — Procedure to be followed by Board</w:t>
-      </w:r>
-    </w:p>
-    <w:p>
-      <w:pPr>
-        <w:spacing w:after="160"/>
-      </w:pPr>
-      <w:r>
-        <w:rPr>
-          <w:strike/>
-          <w:color w:val="595959"/>
-        </w:rPr>
-        <w:t>(1) The Board shall function as an independent body and, for the discharge of its functions under this Act, shall — (a) determine its own procedure for the conduct of its business, including the manner in which the Chairperson and its other Members shall discharge their business among themselves; (b) act as a digital office, with such design and in such manner as may be prescribed, to the extent possible, receiving complaints, documents through digital means and, for the purposes of inquiry, hearing the concerned parties through digital means, excepting situations where, for reasons to be recorded in writing, the Chairperson considers it necessary to summon in-person, any Data Principal, complainant, witness or any other concerned person for the just and proper disposal of the matter.</w:t>
-      </w:r>
-    </w:p>
-    <w:p>
-      <w:pPr>
-        <w:spacing w:after="160"/>
-      </w:pPr>
-      <w:r>
-        <w:rPr>
-          <w:strike/>
-          <w:color w:val="595959"/>
-        </w:rPr>
-        <w:t>(2) The Board shall, on receipt of any intimation of personal data breach under sub-section (6) of section 8 or complaint from a Data Principal or a reference from the Central Government or a State Government or a Court, or on receipt of a direction from the Appellate Tribunal in an appeal against any direction, decision or order of the Board, or on its own knowledge or information available to it, determine whether there exist sufficient grounds to proceed with an inquiry.</w:t>
-      </w:r>
-    </w:p>
-    <w:p>
-      <w:pPr>
-        <w:spacing w:after="160"/>
-      </w:pPr>
-      <w:r>
-        <w:rPr>
-          <w:strike/>
-          <w:color w:val="595959"/>
-        </w:rPr>
-        <w:t>(3) Where the Board finds that there does not exist sufficient grounds to proceed with the inquiry, it shall close proceedings and record reasons in writing.</w:t>
-      </w:r>
-    </w:p>
-    <w:p>
-      <w:pPr>
-        <w:spacing w:after="160"/>
-      </w:pPr>
-      <w:r>
-        <w:rPr>
-          <w:strike/>
-          <w:color w:val="595959"/>
-        </w:rPr>
-        <w:t>(4) Where the Board finds that there exists sufficient grounds to proceed with the inquiry, it shall conduct such inquiry in accordance with such procedure as may be prescribed, before making its decision.</w:t>
-      </w:r>
-    </w:p>
-    <w:p>
-      <w:pPr>
-        <w:spacing w:after="160"/>
-      </w:pPr>
-      <w:r>
-        <w:rPr>
-          <w:strike/>
-          <w:color w:val="595959"/>
-        </w:rPr>
-        <w:t>(5) No such inquiry as referred to in sub-section (4) shall be conducted unless the Board has served a notice on the Data Fiduciary or the Data Processor, if applicable, or the Consent Manager, as the case may be, calling upon it to justify as to why such an inquiry should not be initiated against it.</w:t>
-      </w:r>
-    </w:p>
-    <w:p>
-      <w:pPr>
-        <w:spacing w:after="160"/>
-      </w:pPr>
-      <w:r>
-        <w:rPr>
-          <w:strike/>
-          <w:color w:val="595959"/>
-        </w:rPr>
-        <w:t>(6) The Board shall, in relation to the discharge of its functions under this Act, follow the principle of natural justice.</w:t>
-      </w:r>
-    </w:p>
-    <w:p>
-      <w:pPr>
-        <w:spacing w:after="160"/>
-      </w:pPr>
-      <w:r>
-        <w:rPr>
-          <w:strike/>
-          <w:color w:val="595959"/>
-        </w:rPr>
-        <w:t>(7) The Board shall, for the purpose of discharging its functions under this Act, have the same powers as are vested in a civil court under the Code of Civil Procedure, 1908, while trying a suit, in respect of the following matters, namely: — (a) summoning and enforcing the attendance of any person and examining her on oath; (b) receiving evidence on affidavit; (c) subject to the provisions of sections 123 and 124 of the Indian Evidence Act, 1872, requisitioning any public record or document or copy of such record or document from any office; (d) inspecting any data, book, document, register, books of account or any other document; (e) such other matters as may be prescribed.</w:t>
-      </w:r>
-    </w:p>
-    <w:p>
-      <w:pPr>
-        <w:spacing w:after="160"/>
-      </w:pPr>
-      <w:r>
-        <w:rPr>
-          <w:strike/>
-          <w:color w:val="595959"/>
-        </w:rPr>
-        <w:t>(8) The Board or any of its officers not below the rank of a Secretary to the Board, if authorised by the Board, shall not have the power to (a) block, or seize any premises, computer resource or other equipment used for or involved in the conduct of the day-to-day business or functions of a Data Fiduciary or Data Processor, or an intermediary; (b) require the disclosure of any information that is protected on the grounds of legal privilege.</w:t>
-      </w:r>
-    </w:p>
-    <w:p>
-      <w:pPr>
-        <w:spacing w:after="160"/>
-      </w:pPr>
-      <w:r>
-        <w:rPr>
-          <w:strike/>
-          <w:color w:val="595959"/>
-        </w:rPr>
-        <w:t>(9) The Board may, if it considers it necessary in the interest of justice, require the police or any officer of the Central Government or a State Government to render such assistance as may be necessary for discharge of its functions under this Act.</w:t>
-      </w:r>
-    </w:p>
-    <w:p>
-      <w:pPr>
-        <w:spacing w:after="160"/>
-      </w:pPr>
-      <w:r>
-        <w:rPr>
-          <w:strike/>
-          <w:color w:val="595959"/>
-        </w:rPr>
-        <w:t>(10) The Board may, at any time during the inquiry, if it considers necessary, by order, give such interim orders as it may think fit, after giving an opportunity of hearing to the person likely to be affected by such order.</w:t>
-      </w:r>
-    </w:p>
-    <w:p>
-      <w:pPr>
-        <w:spacing w:after="160"/>
-      </w:pPr>
-      <w:r>
-        <w:rPr>
-          <w:strike/>
-          <w:color w:val="595959"/>
-        </w:rPr>
-        <w:t>(11) The Board shall, after the conclusion of an inquiry initiated on the basis of information available to it, and after giving the concerned parties an opportunity of being heard, — (a) if satisfied that no breach of any of the provisions of this Act or the rules made thereunder has occurred, close the proceedings; or (b) if satisfied that breach of any provisions of this Act or the rules made thereunder by any person has occurred, proceed as per the provisions of section 33.</w:t>
-      </w:r>
-    </w:p>
-    <w:p>
-      <w:pPr>
-        <w:spacing w:after="160"/>
-      </w:pPr>
-      <w:r>
-        <w:rPr>
-          <w:strike/>
-          <w:color w:val="595959"/>
-        </w:rPr>
-        <w:t>(12) The Board may, if it is satisfied that a complaint is false or frivolous, issue a warning or impose costs on the complainant.</w:t>
       </w:r>
     </w:p>
     <w:p>
@@ -3899,7 +3315,7 @@
           <w:color w:val="595959"/>
           <w:sz w:val="17"/>
         </w:rPr>
-        <w:t>Note: In force eighteen months after notification (G.S.R. 843(E), group (c)) — not yet operative. Text corrected 2026-09-23 against the official Act PDF (SHA-256 4deb2398...7d15), independently verified twice (two PDF extraction methods, two review passes) — see docs/act_table_audit_2026-09-23.md.</w:t>
+        <w:t>Note: In force eighteen months after notification (G.S.R. 843(E), group (c)) — not yet operative. Text corrected 2026-09-23 against the official Act PDF (SHA-256 4deb2398...7d15), re-verified against a hash-confirmed copy of the source PDF (second extraction pass; Sonnet+Opus review) — see docs/act_table_audit_2026-09-23.md.</w:t>
       </w:r>
     </w:p>
     <w:p/>
@@ -4824,7 +4240,6 @@
       <w:r>
         <w:rPr>
           <w:b/>
-          <w:highlight w:val="yellow"/>
         </w:rPr>
         <w:t>Section 42 — Power to amend Schedule</w:t>
       </w:r>
@@ -4834,9 +4249,6 @@
         <w:spacing w:after="160"/>
       </w:pPr>
       <w:r>
-        <w:rPr>
-          <w:highlight w:val="yellow"/>
-        </w:rPr>
         <w:t>(1) The Central Government may, by notification, amend the Schedule, subject to the restriction that no such notification shall have the effect of increasing any penalty specified therein to more than twice of what was specified in it when this Act was originally enacted.</w:t>
       </w:r>
     </w:p>
@@ -4845,56 +4257,6 @@
         <w:spacing w:after="160"/>
       </w:pPr>
       <w:r>
-        <w:rPr>
-          <w:highlight w:val="yellow"/>
-        </w:rPr>
-        <w:t>(2) Any amendment notified under sub-section (1) shall have effect as if enacted in this Act and shall come into force on the date of the notification.</w:t>
-      </w:r>
-    </w:p>
-    <w:p>
-      <w:r>
-        <w:rPr>
-          <w:b/>
-          <w:color w:val="595959"/>
-          <w:sz w:val="18"/>
-        </w:rPr>
-        <w:t>Previous text (superseded):</w:t>
-      </w:r>
-    </w:p>
-    <w:p>
-      <w:pPr>
-        <w:spacing w:after="160"/>
-      </w:pPr>
-      <w:r>
-        <w:rPr>
-          <w:b/>
-          <w:strike/>
-          <w:color w:val="595959"/>
-        </w:rPr>
-        <w:t>Section 42 — Power to amend Schedule</w:t>
-      </w:r>
-    </w:p>
-    <w:p>
-      <w:pPr>
-        <w:spacing w:after="160"/>
-      </w:pPr>
-      <w:r>
-        <w:rPr>
-          <w:strike/>
-          <w:color w:val="595959"/>
-        </w:rPr>
-        <w:t>(1) The Central Government may, by notification, amend the Schedule so, however, that the amount specified therein in respect of any breach shall not, in aggregate, exceed two hundred and fifty crore rupees at any given time, and every such notification shall be laid before each House of Parliament.</w:t>
-      </w:r>
-    </w:p>
-    <w:p>
-      <w:pPr>
-        <w:spacing w:after="160"/>
-      </w:pPr>
-      <w:r>
-        <w:rPr>
-          <w:strike/>
-          <w:color w:val="595959"/>
-        </w:rPr>
         <w:t>(2) Any amendment notified under sub-section (1) shall have effect as if enacted in this Act and shall come into force on the date of the notification.</w:t>
       </w:r>
     </w:p>
@@ -4905,7 +4267,7 @@
           <w:color w:val="595959"/>
           <w:sz w:val="17"/>
         </w:rPr>
-        <w:t>Note: Currently in force. Text corrected 2026-09-23 against the official Act PDF (SHA-256 4deb2398...7d15), independently verified twice (two PDF extraction methods, two review passes) — see docs/act_table_audit_2026-09-23.md.</w:t>
+        <w:t>Note: Currently in force. Text corrected 2026-09-23 against the official Act PDF (SHA-256 4deb2398...7d15), re-verified against a hash-confirmed copy of the source PDF (second extraction pass; Sonnet+Opus review) — see docs/act_table_audit_2026-09-23.md.</w:t>
       </w:r>
     </w:p>
     <w:p/>
@@ -5006,7 +4368,6 @@
       <w:r>
         <w:rPr>
           <w:b/>
-          <w:highlight w:val="yellow"/>
         </w:rPr>
         <w:t>Section 44(1),(3) — Amendments to certain Acts</w:t>
       </w:r>
@@ -5016,9 +4377,6 @@
         <w:spacing w:after="160"/>
       </w:pPr>
       <w:r>
-        <w:rPr>
-          <w:highlight w:val="yellow"/>
-        </w:rPr>
         <w:t>(1) In section 14 of the Telecom Regulatory Authority of India Act, 1997, in clause (c), for sub-clauses (i) and (ii), the following sub-clauses shall be substituted, namely — "(i) the Appellate Tribunal under the Information Technology Act, 2000; (ii) the Appellate Tribunal under the Airports Economic Regulatory Authority of India Act, 2008; and (iii) the Appellate Tribunal under the Digital Personal Data Protection Act, 2023.".</w:t>
       </w:r>
     </w:p>
@@ -5027,57 +4385,7 @@
         <w:spacing w:after="160"/>
       </w:pPr>
       <w:r>
-        <w:rPr>
-          <w:highlight w:val="yellow"/>
-        </w:rPr>
         <w:t>(3) In section 8 of the Right to Information Act, 2005, in sub-section (1), for clause (j), the following clause shall be substituted, namely — "(j) information which relates to personal information;".</w:t>
-      </w:r>
-    </w:p>
-    <w:p>
-      <w:r>
-        <w:rPr>
-          <w:b/>
-          <w:color w:val="595959"/>
-          <w:sz w:val="18"/>
-        </w:rPr>
-        <w:t>Previous text (superseded):</w:t>
-      </w:r>
-    </w:p>
-    <w:p>
-      <w:pPr>
-        <w:spacing w:after="160"/>
-      </w:pPr>
-      <w:r>
-        <w:rPr>
-          <w:b/>
-          <w:strike/>
-          <w:color w:val="595959"/>
-        </w:rPr>
-        <w:t>Section 44(1),(3) — Amendments to certain Acts</w:t>
-      </w:r>
-    </w:p>
-    <w:p>
-      <w:pPr>
-        <w:spacing w:after="160"/>
-      </w:pPr>
-      <w:r>
-        <w:rPr>
-          <w:strike/>
-          <w:color w:val="595959"/>
-        </w:rPr>
-        <w:t>(1) In the Telecom Regulatory Authority of India Act, 1997, in section 14, in clause (c), after sub-clause (ii), the following sub-clause shall be inserted, namely — "(iii) the Digital Personal Data Protection Act, 2023;".</w:t>
-      </w:r>
-    </w:p>
-    <w:p>
-      <w:pPr>
-        <w:spacing w:after="160"/>
-      </w:pPr>
-      <w:r>
-        <w:rPr>
-          <w:strike/>
-          <w:color w:val="595959"/>
-        </w:rPr>
-        <w:t>(3) In the Right to Information Act, 2005, in section 8, in sub-section (1), for clause (j), the following clause shall be substituted, namely — "(j) information which relates to personal information;".</w:t>
       </w:r>
     </w:p>
     <w:p>
@@ -5087,7 +4395,7 @@
           <w:color w:val="595959"/>
           <w:sz w:val="17"/>
         </w:rPr>
-        <w:t>Note: Currently in force. Text corrected 2026-09-23 against the official Act PDF (SHA-256 4deb2398...7d15), independently verified twice (two PDF extraction methods, two review passes) — see docs/act_table_audit_2026-09-23.md.</w:t>
+        <w:t>Note: Currently in force. Text corrected 2026-09-23 against the official Act PDF (SHA-256 4deb2398...7d15), re-verified against a hash-confirmed copy of the source PDF (second extraction pass; Sonnet+Opus review) — see docs/act_table_audit_2026-09-23.md.</w:t>
       </w:r>
     </w:p>
     <w:p/>
@@ -5124,7 +4432,6 @@
       <w:r>
         <w:rPr>
           <w:b/>
-          <w:highlight w:val="yellow"/>
         </w:rPr>
         <w:t>Section 44(2) — Amendments to the Information Technology Act, 2000</w:t>
       </w:r>
@@ -5134,45 +4441,7 @@
         <w:spacing w:after="160"/>
       </w:pPr>
       <w:r>
-        <w:rPr>
-          <w:highlight w:val="yellow"/>
-        </w:rPr>
         <w:t>The Information Technology Act, 2000 shall be amended in the following manner, namely — (a) section 43A shall be omitted; (b) in section 81, in the proviso, after the words and figures "the Patents Act, 1970", the words and figures "or the Digital Personal Data Protection Act, 2023" shall be inserted; and (c) in section 87, in sub-section (2), clause (ob) shall be omitted.</w:t>
-      </w:r>
-    </w:p>
-    <w:p>
-      <w:r>
-        <w:rPr>
-          <w:b/>
-          <w:color w:val="595959"/>
-          <w:sz w:val="18"/>
-        </w:rPr>
-        <w:t>Previous text (superseded):</w:t>
-      </w:r>
-    </w:p>
-    <w:p>
-      <w:pPr>
-        <w:spacing w:after="160"/>
-      </w:pPr>
-      <w:r>
-        <w:rPr>
-          <w:b/>
-          <w:strike/>
-          <w:color w:val="595959"/>
-        </w:rPr>
-        <w:t>Section 44(2) — Amendments to the Information Technology Act, 2000</w:t>
-      </w:r>
-    </w:p>
-    <w:p>
-      <w:pPr>
-        <w:spacing w:after="160"/>
-      </w:pPr>
-      <w:r>
-        <w:rPr>
-          <w:strike/>
-          <w:color w:val="595959"/>
-        </w:rPr>
-        <w:t>In the Information Technology Act, 2000, — (a) section 43A shall be omitted; (b) in section 81, in the proviso, for the words "the Patents Act, 1970", the words "the Patents Act, 1970 and the Digital Personal Data Protection Act, 2023" shall be substituted; (c) in section 87, in sub-section (2), clause (ob) shall be omitted.</w:t>
       </w:r>
     </w:p>
     <w:p>
@@ -5182,7 +4451,7 @@
           <w:color w:val="595959"/>
           <w:sz w:val="17"/>
         </w:rPr>
-        <w:t>Note: In force eighteen months after notification (G.S.R. 843(E), group (c)) — not yet operative. Text corrected 2026-09-23 against the official Act PDF (SHA-256 4deb2398...7d15), independently verified twice (two PDF extraction methods, two review passes) — see docs/act_table_audit_2026-09-23.md.</w:t>
+        <w:t>Note: In force eighteen months after notification (G.S.R. 843(E), group (c)) — not yet operative. Text corrected 2026-09-23 against the official Act PDF (SHA-256 4deb2398...7d15), re-verified against a hash-confirmed copy of the source PDF (second extraction pass; Sonnet+Opus review) — see docs/act_table_audit_2026-09-23.md.</w:t>
       </w:r>
     </w:p>
     <w:p/>

</xml_diff>